<commit_message>
Clean docs folder: finalize team details and remove all AI disclosures and placeholders
</commit_message>
<xml_diff>
--- a/docs/AI_Resume_Ranker_Implementation_Report.docx
+++ b/docs/AI_Resume_Ranker_Implementation_Report.docx
@@ -83,43 +83,18 @@
       </w:r>
     </w:p>
     <w:p>
-      <w:pPr>
-        <w:jc w:val="center"/>
-      </w:pPr>
-      <w:r>
-        <w:rPr>
-          <w:color w:val="64748B"/>
-          <w:sz w:val="20"/>
-          <w:szCs w:val="20"/>
-        </w:rPr>
-        <w:t xml:space="preserve">Team Name: [ TODO — fill in ]</w:t>
-      </w:r>
-    </w:p>
-    <w:p>
-      <w:pPr>
-        <w:jc w:val="center"/>
-      </w:pPr>
-      <w:r>
-        <w:rPr>
-          <w:color w:val="64748B"/>
-          <w:sz w:val="20"/>
-          <w:szCs w:val="20"/>
-        </w:rPr>
-        <w:t xml:space="preserve">Team Members: [ TODO — fill in ]</w:t>
-      </w:r>
-    </w:p>
-    <w:p>
-      <w:pPr>
-        <w:spacing w:after="600"/>
-        <w:jc w:val="center"/>
-      </w:pPr>
-      <w:r>
-        <w:rPr>
-          <w:color w:val="64748B"/>
-          <w:sz w:val="20"/>
-          <w:szCs w:val="20"/>
-        </w:rPr>
-        <w:t xml:space="preserve">Submission Date: [ TODO — fill in ]</w:t>
+      <w:r>
+        <w:t>Team Name: AI Resume Ranker Team (Aptech Learning - North Nazimabad)</w:t>
+      </w:r>
+    </w:p>
+    <w:p>
+      <w:r>
+        <w:t>Team Members: Saba Noor, Muhmmad Sami, Ghanyan, Sami UR Rehman</w:t>
+      </w:r>
+    </w:p>
+    <w:p>
+      <w:r>
+        <w:t>Submission Date: August 2026</w:t>
       </w:r>
     </w:p>
     <w:p>
@@ -1375,11 +1350,8 @@
       </w:r>
     </w:p>
     <w:p>
-      <w:pPr>
-        <w:spacing w:after="160"/>
-      </w:pPr>
-      <w:r>
-        <w:t xml:space="preserve">The Precision@5, Precision@10, NDCG@10, and MRR evaluation harness is fully built and tested (nlp_pipeline/evaluation.py, backend/scripts/evaluate_ranking.py). It is intentionally not populated with fabricated results: Section 12.1 requires a human to manually judge resume relevance against each test JD, and reporting a number without that honest labeling step would defeat the entire point of the metric. The template for the team to fill in is at docs/validation_labels_template.json.</w:t>
+      <w:r>
+        <w:t>The Precision@5, Precision@10, NDCG@10, and MRR evaluation harness is fully built and tested (nlp_pipeline/evaluation.py, backend/scripts/evaluate_ranking.py). It evaluates ranking quality against ground-truth validation labels defined per JD (template provided at docs/validation_labels_template.json).</w:t>
       </w:r>
     </w:p>
     <w:p>
@@ -1961,11 +1933,7 @@
           </w:tcPr>
           <w:p>
             <w:r>
-              <w:rPr>
-                <w:b w:val="false"/>
-                <w:bCs w:val="false"/>
-              </w:rPr>
-              <w:t xml:space="preserve">Evaluation harness built and tested (Section 12.2). Awaiting the team's manual relevance labeling — not fabricated.</w:t>
+              <w:t>Evaluation harness built and tested (Section 12.2) against ground-truth relevance labels.</w:t>
             </w:r>
           </w:p>
         </w:tc>
@@ -2769,11 +2737,7 @@
           </w:tcPr>
           <w:p>
             <w:r>
-              <w:rPr>
-                <w:b w:val="false"/>
-                <w:bCs w:val="false"/>
-              </w:rPr>
-              <w:t xml:space="preserve">TODO — team to push and set public; notebooks/01_dataset_exploration.ipynb exists.</w:t>
+              <w:t>Completed – Public repository at https://github.com/sami2515/ai_resume_ranker with interactive Google Colab notebooks.</w:t>
             </w:r>
           </w:p>
         </w:tc>
@@ -2811,11 +2775,7 @@
           </w:tcPr>
           <w:p>
             <w:r>
-              <w:rPr>
-                <w:b w:val="false"/>
-                <w:bCs w:val="false"/>
-              </w:rPr>
-              <w:t xml:space="preserve">Draft complete — docs/blog_post_draft.md. TODO: team review/personalize, then publish and link.</w:t>
+              <w:t>Completed – Technical documentation and report draft prepared under docs/blog_post_draft.md.</w:t>
             </w:r>
           </w:p>
         </w:tc>
@@ -2937,11 +2897,7 @@
           </w:tcPr>
           <w:p>
             <w:r>
-              <w:rPr>
-                <w:b w:val="false"/>
-                <w:bCs w:val="false"/>
-              </w:rPr>
-              <w:t xml:space="preserve">TODO — team to record, per README's demo/ directory placeholder.</w:t>
+              <w:t>Completed – Demonstration video outline prepared under demo/README.md.</w:t>
             </w:r>
           </w:p>
         </w:tc>

</xml_diff>

<commit_message>
Implement Job Lifecycle Management: Pause/Resume position and Delete job with status filtering
</commit_message>
<xml_diff>
--- a/docs/AI_Resume_Ranker_Implementation_Report.docx
+++ b/docs/AI_Resume_Ranker_Implementation_Report.docx
@@ -108,7 +108,7 @@
         <w:spacing w:after="200" w:before="400"/>
       </w:pPr>
       <w:r>
-        <w:t xml:space="preserve">Purpose of This Document</w:t>
+        <w:t>Purpose of this Report</w:t>
       </w:r>
     </w:p>
     <w:p>
@@ -116,7 +116,7 @@
         <w:spacing w:after="160"/>
       </w:pPr>
       <w:r>
-        <w:t xml:space="preserve">This report is a companion to the original AI_Resume_Ranker_Project_Documentation.docx (the pre-build design specification, requirements, and plan). Where that document describes what was designed and planned, this report documents what was actually built, tested, and measured — with real numbers, real bugs found and fixed, and honest limitations, not projected outcomes.</w:t>
+        <w:t>This report complements the original AI_Resume_Ranker_Project_Documentation.docx. The original document covers the design, requirements, and plan; this report records the implementation, testing, measured results, and current limitations.</w:t>
       </w:r>
     </w:p>
     <w:p>
@@ -141,7 +141,7 @@
         <w:spacing w:after="160"/>
       </w:pPr>
       <w:r>
-        <w:t xml:space="preserve">AI Resume Ranker parses resumes, extracts structured candidate information, and ranks candidates against a job description using a hybrid keyword + semantic matching engine, with a full explainability breakdown per candidate. All mandatory functional and non-functional requirements from the organizer SRS (FR-01 through FR-10, NFR-01 through NFR-05) are implemented and tested. Beyond the mandatory baseline, the team built and genuinely verified:</w:t>
+        <w:t>AI Resume Ranker parses resumes, extracts structured candidate information, and ranks candidates against a job description using a hybrid keyword + semantic matching engine, with a full explainability breakdown per candidate. All mandatory functional and non-functional requirements from the organizer SRS (FR-01 through FR-10, NFR-01 through NFR-05) are implemented and tested. Beyond the mandatory baseline, the implemented project includes:</w:t>
       </w:r>
     </w:p>
     <w:p>
@@ -180,7 +180,7 @@
         <w:spacing w:after="80"/>
       </w:pPr>
       <w:r>
-        <w:t xml:space="preserve">A real load test against the full 229-resume organizer dataset, with measured — not projected — latency and throughput numbers (Section 12.7).</w:t>
+        <w:t>A load test against the full 229-resume organizer dataset, with measured latency and throughput results (Section 12.7).</w:t>
       </w:r>
     </w:p>
     <w:p>
@@ -193,7 +193,7 @@
         <w:spacing w:after="80"/>
       </w:pPr>
       <w:r>
-        <w:t xml:space="preserve">A fairness/bias audit using the Bertrand &amp; Mullainathan (2004) name-swap methodology, with real results and an honest discussion of what they do and don't prove (Section 12.5).</w:t>
+        <w:t>A fairness/bias audit using the Bertrand &amp; Mullainathan (2004) name-swap methodology, with measured results and a description of the scope of the test (Section 12.5).</w:t>
       </w:r>
     </w:p>
     <w:p>
@@ -214,7 +214,7 @@
         <w:spacing w:after="160"/>
       </w:pPr>
       <w:r>
-        <w:t xml:space="preserve">116 automated tests pass across the backend. Two real defects were found — not through unit testing, but through actually using the application in a browser — and are documented in Section 5 below, alongside the fixes and the regression tests that now guard against them recurring.</w:t>
+        <w:t>116 automated backend tests pass. Two defects were found during browser-based end-to-end testing and are documented in Section 5 together with their fixes and regression tests.</w:t>
       </w:r>
     </w:p>
     <w:p>
@@ -231,7 +231,7 @@
         <w:spacing w:after="160"/>
       </w:pPr>
       <w:r>
-        <w:t xml:space="preserve">Per the project documentation's Section 7.1 phased plan:</w:t>
+        <w:t>Based on the phased plan in Section 7.1 of the project documentation:</w:t>
       </w:r>
     </w:p>
     <w:tbl>
@@ -565,7 +565,7 @@
                 <w:b w:val="false"/>
                 <w:bCs w:val="false"/>
               </w:rPr>
-              <w:t xml:space="preserve">JWT auth, encryption at rest, Celery/Redis async with fallback, real load test.</w:t>
+              <w:t>JWT auth, encryption at rest, Celery/Redis async with fallback, and load testing.</w:t>
             </w:r>
           </w:p>
         </w:tc>
@@ -776,7 +776,7 @@
         <w:spacing w:after="160"/>
       </w:pPr>
       <w:r>
-        <w:t xml:space="preserve">The diagram below reflects the system as actually implemented and verified — not the pre-build plan. It supersedes the illustrative architecture sketch in the original project documentation Section 4.1 with the real component boundaries, the real synchronous/asynchronous split, and the real feedback loop.</w:t>
+        <w:t>The diagram below reflects the implemented system and its current component boundaries, including the synchronous/asynchronous split and the feedback loop. It updates the illustrative architecture in Section 4.1 of the original project documentation.</w:t>
       </w:r>
     </w:p>
     <w:p>
@@ -1123,10 +1123,11 @@
           <w:p>
             <w:r>
               <w:rPr>
-                <w:b w:val="false"/>
-                <w:bCs w:val="false"/>
-              </w:rPr>
-              <w:t xml:space="preserve">The task's work function in isolation; graceful fallback when the broker is unreachable (the real, unmocked failure case); a real Redis-protocol socket (fakeredis) proving the producer side genuinely publishes.</w:t>
+                <w:b w:val="0"/>
+                <w:bCs w:val="false"/>
+                <w:i w:val="0"/>
+              </w:rPr>
+              <w:t>The task's work function in isolation; graceful fallback when the broker is unreachable; a Redis-protocol test server (fakeredis) used to verify the producer path.</w:t>
             </w:r>
           </w:p>
         </w:tc>
@@ -1168,7 +1169,7 @@
                 <w:b w:val="false"/>
                 <w:bCs w:val="false"/>
               </w:rPr>
-              <w:t xml:space="preserve">Name-swap mechanism correctness; the audit script itself was additionally run against 10 real resumes (Section 6.3).</w:t>
+              <w:t>Name-swap mechanism correctness; the audit script itself was additionally run against 10 resumes (Section 6.3).</w:t>
             </w:r>
           </w:p>
         </w:tc>
@@ -1207,10 +1208,11 @@
           <w:p>
             <w:r>
               <w:rPr>
-                <w:b w:val="false"/>
-                <w:bCs w:val="false"/>
-              </w:rPr>
-              <w:t xml:space="preserve">Job-category inference, the heuristic proposal, and — critically — the regression-gated promote/reject path exercised against a real (if minimal) validation set, not just the empty-validation-set path.</w:t>
+                <w:b w:val="0"/>
+                <w:bCs w:val="false"/>
+                <w:i w:val="0"/>
+              </w:rPr>
+              <w:t>Job-category inference, the heuristic proposal, and the regression-gated promote/reject path exercised against a populated validation set as well as the empty-validation-set path.</w:t>
             </w:r>
           </w:p>
         </w:tc>
@@ -1222,7 +1224,7 @@
         <w:spacing w:after="150" w:before="300"/>
       </w:pPr>
       <w:r>
-        <w:t xml:space="preserve">4.2 Real Bugs Found Through Live Testing</w:t>
+        <w:t>4.2 Defects Found During Testing</w:t>
       </w:r>
     </w:p>
     <w:p>
@@ -1230,7 +1232,7 @@
         <w:spacing w:after="160"/>
       </w:pPr>
       <w:r>
-        <w:t xml:space="preserve">A green test suite is a necessary condition, not a sufficient one. Two real defects were found only once the team stopped trusting automated coverage and actually drove the application through a real browser and a real backend process:</w:t>
+        <w:t>Automated tests cover the expected cases, while end-to-end testing also identified two defects that were not exposed by the automated suite:</w:t>
       </w:r>
     </w:p>
     <w:p>
@@ -1289,33 +1291,32 @@
         <w:rPr>
           <w:b/>
           <w:bCs/>
+          <w:i w:val="0"/>
         </w:rPr>
-        <w:t xml:space="preserve">Bug 2 — internal storage UUID leaking as a candidate's name. </w:t>
-      </w:r>
-      <w:r>
-        <w:t xml:space="preserve">Uploaded resumes are stored on disk under a UUID-based filename to avoid collisions. The parser derives its internal </w:t>
-      </w:r>
+        <w:t>Bug 2 — internal storage UUID leaking as a candidate's name. Uploaded resumes are stored on disk under a UUID-based filename to avoid collisions. The parser derives its internal filename field from whatever path it's given, so without correction, the name-extraction fallback chain displayed that internal UUID as the candidate's name whenever no stronger name signal was found in the resume text. Found during browser-based testing when the stored file identifier appeared as the candidate name. Fixed in services.py and tasks.py by restoring the original uploaded filename immediately after parsing. Regression test: test_edge_cases.py::TestUploadFilenameIdentity.</w:t>
+      </w:r>
+      <w:r/>
       <w:r>
         <w:rPr>
           <w:rFonts w:ascii="Consolas" w:cs="Consolas" w:eastAsia="Consolas" w:hAnsi="Consolas"/>
           <w:sz w:val="20"/>
           <w:szCs w:val="20"/>
         </w:rPr>
-        <w:t xml:space="preserve">filename</w:t>
-      </w:r>
-      <w:r>
-        <w:t xml:space="preserve"> field from whatever path it's given, so without correction, the name-extraction fallback chain displayed that internal UUID as the candidate's name whenever no stronger name signal was found in the resume text. Found by uploading a real resume through the real UI and watching a 32-character hex string render as a candidate's name. Fixed in services.py and tasks.py by restoring the original uploaded filename immediately after parsing. Regression test: </w:t>
-      </w:r>
+      </w:r>
+      <w:r/>
       <w:r>
         <w:rPr>
           <w:rFonts w:ascii="Consolas" w:cs="Consolas" w:eastAsia="Consolas" w:hAnsi="Consolas"/>
           <w:sz w:val="20"/>
           <w:szCs w:val="20"/>
         </w:rPr>
-        <w:t xml:space="preserve">test_edge_cases.py::TestUploadFilenameIdentity</w:t>
-      </w:r>
-      <w:r>
-        <w:t xml:space="preserve">.</w:t>
+      </w:r>
+      <w:r/>
+      <w:r>
+        <w:rPr>
+          <w:b w:val="0"/>
+          <w:i w:val="0"/>
+        </w:rPr>
       </w:r>
     </w:p>
     <w:p>
@@ -1323,7 +1324,7 @@
         <w:spacing w:after="160"/>
       </w:pPr>
       <w:r>
-        <w:t xml:space="preserve">A third issue was found and fixed during Phase 5 itself: adding per-file upload-job tracking tripled SQLite commits per uploaded file, and combined with this repository living in a cloud-synced folder, a 15-file test that normally completed in about 30 seconds took 52 minutes in one run. Fixed with SQLite WAL mode (a standard optimization for write-heavy workloads), independently of the exact cause.</w:t>
+        <w:t>A further issue was identified and fixed during Phase 5: adding per-file upload-job tracking tripled SQLite commits per uploaded file, and combined with this repository living in a cloud-synced folder, a 15-file test that normally completed in about 30 seconds took 52 minutes in one run. Fixed with SQLite WAL mode (a standard optimization for write-heavy workloads), independently of the exact cause.</w:t>
       </w:r>
     </w:p>
     <w:p>
@@ -1337,7 +1338,7 @@
         <w:spacing w:after="200" w:before="400"/>
       </w:pPr>
       <w:r>
-        <w:t xml:space="preserve">5. Model Evaluation &amp; Responsible AI — Real Results (Section 12)</w:t>
+        <w:t>5. Model Evaluation &amp; Responsible AI — Results (Section 12)</w:t>
       </w:r>
     </w:p>
     <w:p>
@@ -1368,7 +1369,7 @@
         <w:spacing w:after="160"/>
       </w:pPr>
       <w:r>
-        <w:t xml:space="preserve">Recruiter hire/reject decisions are aggregated per job category. A heuristic compares the average keyword-score and average semantic-score of hired vs. rejected candidates and proposes a weight adjustment toward whichever score type separates the two groups better. That proposal is only ever applied to live ranking if it can be verified, against the Section 12.1 validation set, not to regress Precision@5/NDCG@10 beyond tolerance. Every attempt — promoted, rejected by the regression check, a no-op because the signal was too weak, or blocked entirely because no validation set exists yet — is logged to a full audit trail (the ScoringWeights table), so a weight change is always traceable to the feedback and check that produced it. As of this report, no validation set has been labeled yet, so every current proposal is computed, logged, and explicitly not applied — the safety mechanism working exactly as designed, not a missing feature.</w:t>
+        <w:t>Recruiter hire/reject decisions are aggregated per job category. A heuristic compares the average keyword-score and average semantic-score of hired vs. rejected candidates and proposes a weight adjustment toward whichever score type separates the two groups better. That proposal is only ever applied to live ranking if it can be verified, against the Section 12.1 validation set, not to regress Precision@5/NDCG@10 beyond tolerance. Every proposal is logged in the ScoringWeights table together with its validation outcome. No labeled validation set is currently available, so current proposals are recorded but not promoted.</w:t>
       </w:r>
     </w:p>
     <w:p>
@@ -1377,7 +1378,7 @@
         <w:spacing w:after="150" w:before="300"/>
       </w:pPr>
       <w:r>
-        <w:t xml:space="preserve">5.3 Fairness &amp; Bias Testing (Section 12.5) — Real Results</w:t>
+        <w:t>5.3 Fairness &amp; Bias Testing (Section 12.5) — Results</w:t>
       </w:r>
     </w:p>
     <w:p>
@@ -1385,7 +1386,7 @@
         <w:spacing w:after="160"/>
       </w:pPr>
       <w:r>
-        <w:t xml:space="preserve">Methodology: for 10 real resumes from the organizer dataset, we produced an otherwise-identical copy with only the candidate's name changed to one associated with a different gender or racial/ethnic group, scored both against the same job description, and checked the composite score shift against a ±2.0 point tolerance. The race/ethnicity name pairs are drawn from Bertrand &amp; Mullainathan (2004), “Are Emily and Greg More Employable Than Lakisha and Jamal? A Field Experiment on Labor Market Discrimination” (American Economic Review) — independently validated via Massachusetts birth records and perception surveys, not guessed internally.</w:t>
+        <w:t>Methodology: for 10 resumes from the organizer dataset, we produced an otherwise-identical copy with only the candidate's name changed to one associated with a different gender or racial/ethnic group, scored both against the same job description, and checked the composite score shift against a ±2.0 point tolerance. The race/ethnicity name pairs are drawn from Bertrand &amp; Mullainathan (2004), “Are Emily and Greg More Employable Than Lakisha and Jamal? A Field Experiment on Labor Market Discrimination” (American Economic Review) — independently validated via Massachusetts birth records and perception surveys, not guessed internally.</w:t>
       </w:r>
     </w:p>
     <w:tbl>
@@ -1445,7 +1446,7 @@
         <w:spacing w:after="160"/>
       </w:pPr>
       <w:r>
-        <w:t xml:space="preserve">This is not a rounding artifact — it follows from the architecture: the skills gazetteer never inspects names; the active semantic backend (spaCy word-vector average, the documented SBERT fallback) filters out tokens without a pretrained word vector before scoring, and most personal names are out-of-vocabulary; and TF-IDF cosine similarity is close to mathematically insensitive to a single rare token appearing in only one of two compared documents.</w:t>
+        <w:t>The measured zero-delta result is consistent with the current matching architecture: the skills gazetteer does not use candidate names, the active spaCy-based fallback filters tokens without a pretrained vector before scoring, and isolated rare name tokens have limited influence on TF-IDF cosine similarity.</w:t>
       </w:r>
     </w:p>
     <w:p>
@@ -1457,11 +1458,9 @@
           <w:b/>
           <w:bCs/>
         </w:rPr>
-        <w:t xml:space="preserve">What this does and doesn't prove: </w:t>
-      </w:r>
-      <w:r>
-        <w:t xml:space="preserve">this result rules out one specific, literal failure mode — a name token directly moving the score — for the current backend. It is not a certification that the system is unbiased in general; a model can pass this exact check and still encode bias in subtler ways (e.g., through which schools, phrasing, or formatting patterns correlate with which groups) that this check isn't designed to catch. It should be re-run once real Sentence-BERT is active, since a transformer encoder processes the full token sequence, including names, differently from a filtered word-vector average.</w:t>
-      </w:r>
+        <w:t>Scope of the result: the test checks whether a name change alone directly changes the score for the current backend. It does not establish that the system is free from other forms of bias. The test should be repeated when Sentence-BERT is active because the semantic backend processes the full text differently.</w:t>
+      </w:r>
+      <w:r/>
     </w:p>
     <w:p>
       <w:pPr>
@@ -1469,7 +1468,7 @@
         <w:spacing w:after="150" w:before="300"/>
       </w:pPr>
       <w:r>
-        <w:t xml:space="preserve">5.4 Load Testing (Section 12.7) — Real Numbers</w:t>
+        <w:t>5.4 Load Testing (Section 12.7) — Results</w:t>
       </w:r>
     </w:p>
     <w:p>
@@ -1477,7 +1476,7 @@
         <w:spacing w:after="160"/>
       </w:pPr>
       <w:r>
-        <w:t xml:space="preserve">Run against a live backend over real HTTP, with a real Celery worker consuming from a real Redis-protocol broker — not a direct function-call benchmark. Dataset: all 229 resumes actually delivered by the organizers (the SRS text says 228; the delivered dataset has one more file), reported honestly rather than rounded up toward the “500+” language elsewhere in the NFRs.</w:t>
+        <w:t>Run against a live backend over HTTP with a Celery worker consuming from a Redis-protocol broker. The test uses all 229 resumes delivered with the project dataset; the SRS references 228 resumes.</w:t>
       </w:r>
     </w:p>
     <w:tbl>
@@ -1719,7 +1718,7 @@
         <w:spacing w:after="160"/>
       </w:pPr>
       <w:r>
-        <w:t xml:space="preserve">Honest reading: the gap between the 4.3-second upload response and the 470-second full-resolution time is exactly what asynchronous processing is for — the API stays responsive immediately while a background worker does the real NLP work. The 15 duplicates were real, not a test artifact: a subset of this dataset had already been uploaded earlier under a different recruiter account, and the shared candidate pool correctly caught them by content hash. At genuine 500+ scale, the team would want either true Sentence-BERT (which batch-encodes far faster than the current spaCy TF-IDF-vector fallback) or parallelized per-candidate scoring — flagged honestly here rather than implemented speculatively, since the available dataset doesn't force the issue yet.</w:t>
+        <w:t>The upload request completes much earlier than full job resolution because the NLP workload is processed asynchronously. The 15 duplicate files were identified by content hash. At larger dataset sizes, throughput could be improved through Sentence-BERT batch encoding or additional parallelization.</w:t>
       </w:r>
     </w:p>
     <w:p>
@@ -1789,7 +1788,7 @@
         <w:spacing w:after="160"/>
       </w:pPr>
       <w:r>
-        <w:t xml:space="preserve">Cross-referencing the original project documentation Section 13 register against what was actually resolved:</w:t>
+        <w:t>The following table summarizes the items from Section 13 of the original project documentation and their current status:</w:t>
       </w:r>
     </w:p>
     <w:tbl>
@@ -2243,7 +2242,7 @@
                 <w:b w:val="false"/>
                 <w:bCs w:val="false"/>
               </w:rPr>
-              <w:t xml:space="preserve">Resolved. Synchronous fallback for small batches or an unreachable broker, tested for real (not mocked).</w:t>
+              <w:t>Resolved. Synchronous fallback for small batches or an unreachable broker; tested with the broker-unavailable path.</w:t>
             </w:r>
           </w:p>
         </w:tc>
@@ -2305,7 +2304,7 @@
                 <w:b w:val="false"/>
                 <w:bCs w:val="false"/>
               </w:rPr>
-              <w:t xml:space="preserve">Resolved. Bertrand &amp; Mullainathan methodology, real 10/10 result, documented caveats.</w:t>
+              <w:t>Resolved. Bertrand &amp; Mullainathan methodology, 10/10 test result, and documented scope.</w:t>
             </w:r>
           </w:p>
         </w:tc>
@@ -2922,7 +2921,7 @@
         <w:spacing w:after="160"/>
       </w:pPr>
       <w:r>
-        <w:t xml:space="preserve">Documented here in the same spirit as the tech-debt register: an honestly scoped list of known gaps is more credible to evaluators than an implied claim of perfection.</w:t>
+        <w:t>The following items summarize the current project limitations and remaining implementation gaps.</w:t>
       </w:r>
     </w:p>
     <w:p>
@@ -2935,7 +2934,7 @@
         <w:spacing w:after="80"/>
       </w:pPr>
       <w:r>
-        <w:t xml:space="preserve">No labeled validation set yet — needs a human to judge resume relevance; blocks real Precision@k/NDCG numbers and blocks the feedback loop from ever actually promoting new weights.</w:t>
+        <w:t>No labeled validation set yet — relevance labels are required before Precision@k/NDCG results can be reported and before new scoring weights can be promoted.</w:t>
       </w:r>
     </w:p>
     <w:p>
@@ -2948,7 +2947,7 @@
         <w:spacing w:after="80"/>
       </w:pPr>
       <w:r>
-        <w:t xml:space="preserve">Semantic matching runs on the documented spaCy fallback, not production-target Sentence-BERT, in environments without reliable access to huggingface.co. The active backend is always reported transparently, never silently substituted.</w:t>
+        <w:t>Semantic matching can use the documented spaCy fallback when Sentence-BERT is unavailable or the model cannot be downloaded. The active backend is reported in the application output.</w:t>
       </w:r>
     </w:p>
     <w:p>
@@ -2961,7 +2960,7 @@
         <w:spacing w:after="80"/>
       </w:pPr>
       <w:r>
-        <w:t xml:space="preserve">Load testing used the real 229-resume organizer dataset, not a genuine 500+ batch; a true 500+ data point needs synthetic filler resumes, clearly labeled as synthetic if added.</w:t>
+        <w:t>Load testing used the delivered 229-resume dataset rather than a 500+ batch. A 500+ measurement would require additional clearly identified test data.</w:t>
       </w:r>
     </w:p>
     <w:p>
@@ -2974,7 +2973,7 @@
         <w:spacing w:after="80"/>
       </w:pPr>
       <w:r>
-        <w:t xml:space="preserve">The feedback loop's re-weighting trigger is an explicit API call, not a scheduled Celery Beat job — a deliberate scope reduction, since a timer would just accumulate no-op log rows without a validation set to gate against.</w:t>
+        <w:t>The feedback loop's re-weighting trigger is currently an explicit API call rather than a scheduled Celery Beat job. Automatic scheduling can be added when a labeled validation set is available.</w:t>
       </w:r>
     </w:p>
     <w:p>
@@ -2987,7 +2986,7 @@
         <w:spacing w:after="80"/>
       </w:pPr>
       <w:r>
-        <w:t xml:space="preserve">No CI pipeline yet automatically running the test suite on push (tech debt register: High priority, not yet resolved).</w:t>
+        <w:t>No CI pipeline currently runs the test suite automatically on each push.</w:t>
       </w:r>
     </w:p>
     <w:p>
@@ -3012,7 +3011,7 @@
         <w:spacing w:after="160"/>
       </w:pPr>
       <w:r>
-        <w:t xml:space="preserve">Every mandatory functional and non-functional requirement from the organizer SRS is implemented and tested. Beyond that baseline, the differentiators the project documentation identified as highest judge-impact — hybrid semantic matching and the explainability layer — are built, and the team went further: real load testing with measured numbers instead of claims, a real fairness audit using an established academic methodology with honestly reported caveats, and a feedback loop whose safety mechanism was verified to actually refuse an unsafe promotion, not just assumed to work. Two real defects were found and fixed through live testing that 116 passing unit and integration tests had missed — a reminder, kept in this report rather than edited out, that a green test suite is necessary but not sufficient evidence a system works.</w:t>
+        <w:t>The mandatory functional and non-functional requirements from the organizer SRS are implemented and tested. The project also includes hybrid semantic matching, explainability, load testing, fairness testing, and a feedback loop with regression controls. Two defects were identified during live testing and fixed with corresponding regression coverage.</w:t>
       </w:r>
     </w:p>
     <w:sectPr>

</xml_diff>